<commit_message>
Ajout des fichiers generes
</commit_message>
<xml_diff>
--- a/docs/docx/diete_ar_deepl.docx
+++ b/docs/docx/diete_ar_deepl.docx
@@ -7,85 +7,78 @@
         <w:pStyle w:val="Heading1"/>
       </w:pPr>
       <w:r>
-        <w:t>Traduction AR (deepl)</w:t>
+        <w:t>الأطعمة التي يجب تجنبها</w:t>
       </w:r>
     </w:p>
     <w:p>
       <w:r>
-        <w:t>مرسيليا، في…………… من م…………………………………..</w:t>
+        <w:t>الأطعمة التي يجب تجنبها</w:t>
+      </w:r>
+    </w:p>
+    <w:p>
+      <w:r>
+        <w:t>السكر، العسل، المربى، الجيلي، كريمة الكستناء، نوتيلا.</w:t>
       </w:r>
     </w:p>
     <w:p/>
     <w:p>
       <w:r>
-        <w:t>بواسطة: أخصائية تغذية قسم التغذية - مستشفى نورد - شيمين دي بورلي - 13015 مرسيليا الأطعمة التي يجب تجنبها السكر، العسل، المربى، الجيلي، كريمة الكستناء، نوتيلا. الحلوى، الكراميل، النوجا، الحلويات.</w:t>
+        <w:t>الحلوى، الكراميل، النوجا، الحلويات.</w:t>
       </w:r>
     </w:p>
     <w:p>
       <w:r>
-        <w:t xml:space="preserve"> - الشوكولاتة، معجون الفواكه. المعجنات، البسكويت، المخبوزات (الكرواسون، الخبز بالشوكولاتة، البريوش ...). الفواكه المجففة، الفواكه المعلبة. الزبادي، الجبن الأبيض والجبنة الصغيرة بالفواكه، الفلان، الحلويات. الآيس كريم، السوربيه. الحليب المكثف المحلى.</w:t>
+        <w:t>-   الشوكولاتة، معجون الفواكه.</w:t>
       </w:r>
     </w:p>
     <w:p>
       <w:r>
-        <w:t>عصائر الفاكهة، شراب، مشروبات غازية، كوكاكولا، جميع المشروبات السكرية المتوفرة في الأسواق. جميع المشروبات الكحولية. فول الصويا ومنتجات فول الصويا (التوفو). الأطعمة الحامضة أو الحارة. الأطعمة الموصى بها البروتينات الحيوانية: حصة واحدة على الأقل يوميًا</w:t>
-        <w:tab/>
-        <w:tab/>
-        <w:tab/>
-      </w:r>
-    </w:p>
-    <w:p/>
-    <w:p>
-      <w:r>
-        <w:t xml:space="preserve">         اللحوم: لحم البقر، لحم العجل، لحم الضأن، لحم الخنزير، الدجاج، الأرانب، الدجاج البري، الديك الرومي، الديك الرومي الصغير. إذا لم تكن محصنًا ضد داء المقوسات، فتناول اللحوم المطبوخة جيدًا، وتجنب الريليت، والباتيه، وكبد الأوز، واللحوم المعلبة.</w:t>
+        <w:t>المعجنات، البسكويت، المعجنات الفرنسية (الكرواسون، خبز الشوكولاتة، البريوش ...).</w:t>
       </w:r>
     </w:p>
     <w:p>
       <w:r>
-        <w:tab/>
-        <w:t xml:space="preserve">    الأسماك: جميع أنواع الأسماك باستثناء سمك أبو سيف، الروبيان، المحار النيء، الأسماك النيئة (السوشي، التاراما، السوريمي)، الأسماك المدخنة (الرنجة، السلمون، السلمون المرقط). تفضلي الأسماك الزرقاء: التونة، السلمون، الماكريل، السردين.</w:t>
+        <w:t>الفواكه المجففة، الفواكه المسكرة.</w:t>
       </w:r>
     </w:p>
     <w:p>
       <w:r>
-        <w:t xml:space="preserve">         البيض منتجات الألبان: 4 على الأقل يوميًا بالإضافة إلى ما يتم تحضيره الجبن باستثناء: الجبن المصنوع من الحليب الخام، والجبن المبشور الصناعي، وقشرة الجبن. الحليب: نصف منزوع الدسم. منتجات الألبان: طبيعية، غير محلاة.</w:t>
-      </w:r>
-    </w:p>
-    <w:p/>
-    <w:p>
-      <w:r>
-        <w:t xml:space="preserve">الخضروات والفواكه: في كل وجبة. الخضروات الخضراء: طازجة، مجمدة طبيعية: حسب الرغبة. الفواكه: جميعها مسموحة، فاكهة واحدة كحلوى في كل وجبة، حصة الفاكهة تعادل 4 قطع سكر = ½ شمام، 1 شريحة كبيرة من البطيخ (250 غ) </w:t>
+        <w:t>الزبادي، الجبن الأبيض و"بيتي سويس" بالفواكه، الفلان، الحلويات.</w:t>
       </w:r>
     </w:p>
     <w:p>
       <w:r>
-        <w:t>= 1 علبة صغيرة (250 غرام) من الفراولة، التوت، الكشمش، العليق، التوت الأزرق، الكشمش الأسود، ... = 2 ماندرين، 4 كليمنتين "كورسي"، 2 كيوي، 1 جريب فروت صغير = 1 كمثرى، 1 تفاحة، 1 برتقالة، 1 خوخ أو برقوق</w:t>
+        <w:t>الآيس كريم، السوربيه.</w:t>
       </w:r>
     </w:p>
     <w:p>
       <w:r>
-        <w:t>= 3 إلى 4 مشمشات، خوخ، كرز...، 8 ميرابيل، 10 ليتشي طازجة = ¼ أناناس أو 4 شرائح، ½ مانجو أو 1 صغيرة</w:t>
+        <w:t>الحليب المكثف المحلى.</w:t>
       </w:r>
     </w:p>
     <w:p>
       <w:r>
-        <w:t>= 12 إلى 15 حبة عنب أو كرز، 1 موزة صغيرة أو ½ موزة = 2 إلى 3 تمرات، 3 إلى 4 خوخات، 2 إلى 3 تين طازج = 1 كوب كومبوت النشويات: في كل وجبة الخبز: أو البسكويت، خبز التوست ...</w:t>
+        <w:t>عصائر الفاكهة، الشراب، المشروبات الغازية، الكوكا كولا، جميع المشروبات المحلاة المتوفرة في الأسواق.</w:t>
       </w:r>
     </w:p>
     <w:p>
       <w:r>
-        <w:t>الحبوب: المعكرونة، الأرز، السميد، البولنتا، البيلبيل، الكسكس... البطاطس: مهروسة، مطبوخة على البخار، مقلية، مقلية... البقوليات: البازلاء، الفاصوليا، العدس، الحمص، الذرة، الفول، الفاصوليا البيضاء أو الحمراء، البازلاء المكسورة والمنيهوت، الموز الأخضر، اليام...</w:t>
-      </w:r>
-    </w:p>
-    <w:p/>
-    <w:p>
-      <w:r>
-        <w:t>يوم عادي الإفطار: مشروب: شاي، قهوة، كاكاو منتج ألبان: حليب، منتجات ألبان، جبن سكر بطيء: خبز كامل أو حبوب غير محلاة + زبدة الغداء والعشاء: خضروات خضراء حسب الرغبة حصة من اللحم أو السمك أو البيض (أو لحم خنزير) حصة من السكريات البطيئة: طبق صغير من النشويات + قطعة صغيرة من الخبز أو طبق أكبر من النشويات بدون خبز أو قطعة كبيرة من الخبز بدون نشويات منتج ألبان فاكهة</w:t>
+        <w:t>جميع المشروبات الكحولية.</w:t>
       </w:r>
     </w:p>
     <w:p>
       <w:r>
-        <w:t>وجبة خفيفة إذا لزم الأمر: إذا كنت جائعًا حقًا، فتناول فقط الأطعمة التي لا تحتوي على سكريات  منتجات الألبان  الخضروات النيئة بيضة مسلوقة، لحم خنزير مقدد......</w:t>
+        <w:t>فول الصويا والمنتجات المصنوعة من فول الصويا (التوفو)</w:t>
+      </w:r>
+    </w:p>
+    <w:p>
+      <w:r>
+        <w:t>الأطعمة الحامضة أو الحارة.</w:t>
+      </w:r>
+    </w:p>
+    <w:p>
+      <w:r>
+        <w:t>AL</w:t>
       </w:r>
     </w:p>
     <w:p>
@@ -134,29 +127,185 @@
         <w:t>رابط مشغل الصوت: https://daryazdr.github.io/Gestion-de-projet-M1-IDL-UGA/player/diete_ar_deepl.html</w:t>
       </w:r>
     </w:p>
-    <w:p>
-      <w:r>
-        <w:br w:type="page"/>
-      </w:r>
-    </w:p>
+    <w:p/>
     <w:p>
       <w:pPr>
         <w:pStyle w:val="Heading1"/>
       </w:pPr>
       <w:r>
-        <w:t>Images du document source</w:t>
+        <w:t>الأطعمة الموصى بها</w:t>
       </w:r>
     </w:p>
     <w:p>
       <w:r>
-        <w:t>diete_docx_1.jpeg</w:t>
+        <w:t>الأطعمة الموصى بها</w:t>
+      </w:r>
+    </w:p>
+    <w:p>
+      <w:r>
+        <w:t>البروتينات الحيوانية: حصة واحدة على الأقل يوميًا</w:t>
+      </w:r>
+    </w:p>
+    <w:p/>
+    <w:p>
+      <w:r>
+        <w:t>اللحوم: لحم البقر، لحم العجل، لحم الضأن، لحم الخنزير، الدجاج، الأرنب، الدجاج البري، الديك الرومي، الديك الرومي الصغير.</w:t>
+      </w:r>
+    </w:p>
+    <w:p>
+      <w:r>
+        <w:t>إذا لم تكوني محصنة ضد داء المقوسات، فتناولي اللحوم المطهية جيدًا، وتجنبي الريليت، والباتيه، وكبد الإوز، واللحوم في الهلام.</w:t>
+      </w:r>
+    </w:p>
+    <w:p>
+      <w:r>
+        <w:t>الأسماك:  جميعها باستثناء سمك أبو سيف، والروبيان، والمحار النيء، والأسماك النيئة (السوشي، والتاراما، والسوريمي)، والأسماك المدخنة (الرنجة، والسلمون، والسلمون المرقط). يفضل تناول الأسماك الزرقاء: التونة، والسلمون، والماكريل، والسردين.</w:t>
+      </w:r>
+    </w:p>
+    <w:p>
+      <w:r>
+        <w:t>البيض</w:t>
+      </w:r>
+    </w:p>
+    <w:p/>
+    <w:p>
+      <w:r>
+        <w:t>منتجات الألبان: 4 على الأقل يوميًا  بالإضافة إلى ما يتم تحضيره</w:t>
+      </w:r>
+    </w:p>
+    <w:p/>
+    <w:p>
+      <w:r>
+        <w:t>الجبن باستثناء: الجبن المصنوع من الحليب الخام، الجبن المبشور الصناعي، قشرة الجبن.</w:t>
+      </w:r>
+    </w:p>
+    <w:p>
+      <w:r>
+        <w:t>الحليب: نصف منزوع الدسم.</w:t>
+      </w:r>
+    </w:p>
+    <w:p>
+      <w:r>
+        <w:t>منتجات الألبان: طبيعية، غير محلاة.</w:t>
+      </w:r>
+    </w:p>
+    <w:p/>
+    <w:p>
+      <w:r>
+        <w:t>الخضروات والفواكه:  في كل وجبة</w:t>
+      </w:r>
+    </w:p>
+    <w:p>
+      <w:r>
+        <w:t>.</w:t>
+      </w:r>
+    </w:p>
+    <w:p>
+      <w:r>
+        <w:t>الخضروات الخضراء: طازجة، مجمدة بدون إضافات: حسب الرغبة.</w:t>
+      </w:r>
+    </w:p>
+    <w:p>
+      <w:r>
+        <w:t>الفواكه:  جميعها مسموح بها، فاكهة واحدة كحلوى في كل وجبة،</w:t>
+      </w:r>
+    </w:p>
+    <w:p>
+      <w:r>
+        <w:t>حصة من الفاكهة تعادل  4 قطع من السكر</w:t>
+      </w:r>
+    </w:p>
+    <w:p>
+      <w:r>
+        <w:t>= ½ شمام،    شريحة كبيرة من البطيخ (250 غ)</w:t>
+      </w:r>
+    </w:p>
+    <w:p>
+      <w:r>
+        <w:t>= 1 علبة صغيرة (250 غ) من الفراولة، التوت، الكشمش، العليق،  التوت البري، الكاسيس، …</w:t>
+      </w:r>
+    </w:p>
+    <w:p>
+      <w:r>
+        <w:t>= 2 ماندرين، 4 كليمنتين «كورسي»، 2 كيوي، 1 جريب فروت صغير</w:t>
+      </w:r>
+    </w:p>
+    <w:p>
+      <w:r>
+        <w:t>= 1 كمثرى، 1 تفاحة، 1 برتقالة، 1 خوخ أو بروغنون</w:t>
+      </w:r>
+    </w:p>
+    <w:p>
+      <w:r>
+        <w:t>= 3 إلى 4 مشمش، كويتش، رين كلود...، 8 ميرابيل، 10 ليتشي طازج</w:t>
+      </w:r>
+    </w:p>
+    <w:p>
+      <w:r>
+        <w:t>= ¼ أناناس أو 4 شرائح، ½ مانجو أو 1 صغيرة</w:t>
+      </w:r>
+    </w:p>
+    <w:p>
+      <w:r>
+        <w:t>= 12 إلى 15 حبة عنب أو كرز، 1 صغيرة أو ½ موزة</w:t>
+      </w:r>
+    </w:p>
+    <w:p>
+      <w:r>
+        <w:t>= 2 إلى 3 حبات تمر، 3 إلى 4 حبات خوخ مجفف، 2 إلى 3 حبات تين طازج</w:t>
+      </w:r>
+    </w:p>
+    <w:p>
+      <w:r>
+        <w:t>= 1 كوب من الكومبوت</w:t>
+      </w:r>
+    </w:p>
+    <w:p>
+      <w:r>
+        <w:t>الأطعمة النشوية: في كل وجبة</w:t>
+      </w:r>
+    </w:p>
+    <w:p>
+      <w:r>
+        <w:t>الخبز: أو  البسكويت، خبز الماي...</w:t>
+      </w:r>
+    </w:p>
+    <w:p>
+      <w:r>
+        <w:t>الحبوب: المعكرونة، الأرز، السميد، البولينتا، البيلبيل، الكسكس...</w:t>
+      </w:r>
+    </w:p>
+    <w:p>
+      <w:r>
+        <w:t>البطاطس: مهروسة، مطبوخة على البخار، مقلية، مقلية ...</w:t>
+      </w:r>
+    </w:p>
+    <w:p>
+      <w:r>
+        <w:t>البقوليات: البازلاء، الفاصوليا، العدس، الحمص، الذرة، الفول، الفاصوليا  البيضاء أو الحمراء، البازلاء المكسرة والمنيهوت، الموز الأخضر، اليام ...</w:t>
+      </w:r>
+    </w:p>
+    <w:p/>
+    <w:p>
+      <w:r>
+        <w:t>يوم نموذجي</w:t>
+      </w:r>
+    </w:p>
+    <w:p>
+      <w:r>
+        <w:t>الإفطار</w:t>
+      </w:r>
+    </w:p>
+    <w:p>
+      <w:r>
+        <w:t>رمز QR لمشغل الصوت:</w:t>
       </w:r>
     </w:p>
     <w:p>
       <w:r>
         <w:drawing>
           <wp:inline xmlns:a="http://schemas.openxmlformats.org/drawingml/2006/main" xmlns:pic="http://schemas.openxmlformats.org/drawingml/2006/picture">
-            <wp:extent cx="5029200" cy="5946205"/>
+            <wp:extent cx="1371600" cy="1371600"/>
             <wp:docPr id="2" name="Picture 2"/>
             <wp:cNvGraphicFramePr>
               <a:graphicFrameLocks noChangeAspect="1"/>
@@ -165,11 +314,11 @@
               <a:graphicData uri="http://schemas.openxmlformats.org/drawingml/2006/picture">
                 <pic:pic>
                   <pic:nvPicPr>
-                    <pic:cNvPr id="0" name="diete_docx_1.jpeg"/>
+                    <pic:cNvPr id="0" name="diete_ar_deepl.png"/>
                     <pic:cNvPicPr/>
                   </pic:nvPicPr>
                   <pic:blipFill>
-                    <a:blip r:embed="rId10"/>
+                    <a:blip r:embed="rId9"/>
                     <a:stretch>
                       <a:fillRect/>
                     </a:stretch>
@@ -177,7 +326,7 @@
                   <pic:spPr>
                     <a:xfrm>
                       <a:off x="0" y="0"/>
-                      <a:ext cx="5029200" cy="5946205"/>
+                      <a:ext cx="1371600" cy="1371600"/>
                     </a:xfrm>
                     <a:prstGeom prst="rect"/>
                   </pic:spPr>
@@ -186,6 +335,156 @@
             </a:graphic>
           </wp:inline>
         </w:drawing>
+      </w:r>
+    </w:p>
+    <w:p>
+      <w:r>
+        <w:t>رابط مشغل الصوت: https://daryazdr.github.io/Gestion-de-projet-M1-IDL-UGA/player/diete_ar_deepl.html</w:t>
+      </w:r>
+    </w:p>
+    <w:p/>
+    <w:p>
+      <w:pPr>
+        <w:pStyle w:val="Heading1"/>
+      </w:pPr>
+      <w:r>
+        <w:t>يوم نموذجي</w:t>
+      </w:r>
+    </w:p>
+    <w:p>
+      <w:r>
+        <w:t>الإفطار:</w:t>
+      </w:r>
+    </w:p>
+    <w:p>
+      <w:r>
+        <w:t>مشروب: شاي، قهوة، كاكاو</w:t>
+      </w:r>
+    </w:p>
+    <w:p>
+      <w:r>
+        <w:t>منتج ألبان: حليب، منتجات ألبان، جبن</w:t>
+      </w:r>
+    </w:p>
+    <w:p>
+      <w:r>
+        <w:t>مصدر كربوهيدرات بطيئة: خبز كامل الحبوب أو خبز الحبوب غير المحلى + زبدة</w:t>
+      </w:r>
+    </w:p>
+    <w:p>
+      <w:r>
+        <w:t>الغداء والعشاء:</w:t>
+      </w:r>
+    </w:p>
+    <w:p>
+      <w:r>
+        <w:t>خضروات خضراء حسب الرغبة</w:t>
+      </w:r>
+    </w:p>
+    <w:p>
+      <w:r>
+        <w:t>حصة من اللحم أو السمك أو البيض (أو لحم خنزير)</w:t>
+      </w:r>
+    </w:p>
+    <w:p>
+      <w:r>
+        <w:t>حصة من السكريات البطيئة:</w:t>
+      </w:r>
+    </w:p>
+    <w:p>
+      <w:r>
+        <w:t>طبق صغير من النشويات + قطعة صغيرة من الخبز</w:t>
+      </w:r>
+    </w:p>
+    <w:p>
+      <w:r>
+        <w:t>أو   طبق أكبر من النشويات ولكن بدون خبز</w:t>
+      </w:r>
+    </w:p>
+    <w:p>
+      <w:r>
+        <w:t>أو   قطعة كبيرة من الخبز بدون نشويات</w:t>
+      </w:r>
+    </w:p>
+    <w:p>
+      <w:r>
+        <w:t>منتج ألبان</w:t>
+      </w:r>
+    </w:p>
+    <w:p>
+      <w:r>
+        <w:t>فاكهة</w:t>
+      </w:r>
+    </w:p>
+    <w:p>
+      <w:r>
+        <w:t>وجبة خفيفة اختيارية:</w:t>
+      </w:r>
+    </w:p>
+    <w:p>
+      <w:r>
+        <w:t>إذا كنت تشعر بالجوع حقًا،  تناول فقط الأطعمة التي لا تحتوي على سكريات</w:t>
+      </w:r>
+    </w:p>
+    <w:p>
+      <w:r>
+        <w:t>منتجات ألبان</w:t>
+      </w:r>
+    </w:p>
+    <w:p>
+      <w:r>
+        <w:t>خضروات نيئة</w:t>
+      </w:r>
+    </w:p>
+    <w:p>
+      <w:r>
+        <w:t>بيضة مسلوقة، لحم خنزير……</w:t>
+      </w:r>
+    </w:p>
+    <w:p>
+      <w:r>
+        <w:t>رمز QR لمشغل الصوت:</w:t>
+      </w:r>
+    </w:p>
+    <w:p>
+      <w:r>
+        <w:drawing>
+          <wp:inline xmlns:a="http://schemas.openxmlformats.org/drawingml/2006/main" xmlns:pic="http://schemas.openxmlformats.org/drawingml/2006/picture">
+            <wp:extent cx="1371600" cy="1371600"/>
+            <wp:docPr id="3" name="Picture 3"/>
+            <wp:cNvGraphicFramePr>
+              <a:graphicFrameLocks noChangeAspect="1"/>
+            </wp:cNvGraphicFramePr>
+            <a:graphic>
+              <a:graphicData uri="http://schemas.openxmlformats.org/drawingml/2006/picture">
+                <pic:pic>
+                  <pic:nvPicPr>
+                    <pic:cNvPr id="0" name="diete_ar_deepl.png"/>
+                    <pic:cNvPicPr/>
+                  </pic:nvPicPr>
+                  <pic:blipFill>
+                    <a:blip r:embed="rId9"/>
+                    <a:stretch>
+                      <a:fillRect/>
+                    </a:stretch>
+                  </pic:blipFill>
+                  <pic:spPr>
+                    <a:xfrm>
+                      <a:off x="0" y="0"/>
+                      <a:ext cx="1371600" cy="1371600"/>
+                    </a:xfrm>
+                    <a:prstGeom prst="rect"/>
+                  </pic:spPr>
+                </pic:pic>
+              </a:graphicData>
+            </a:graphic>
+          </wp:inline>
+        </w:drawing>
+      </w:r>
+    </w:p>
+    <w:p>
+      <w:r>
+        <w:t>رابط مشغل الصوت: https://daryazdr.github.io/Gestion-de-projet-M1-IDL-UGA/player/diete_ar_deepl.html</w:t>
       </w:r>
     </w:p>
     <w:sectPr>

</xml_diff>

<commit_message>
Final test. Pipeline changé. Suppression d'anciens fichiers
</commit_message>
<xml_diff>
--- a/docs/docx/diete_ar_deepl.docx
+++ b/docs/docx/diete_ar_deepl.docx
@@ -12,73 +12,77 @@
     </w:p>
     <w:p>
       <w:r>
-        <w:t>الأطعمة التي يجب تجنبها</w:t>
+        <w:t>الأطعمة الممنوعة</w:t>
       </w:r>
     </w:p>
     <w:p>
       <w:r>
-        <w:t>السكر، العسل، المربى، الجيلي، كريمة الكستناء، نوتيلا.</w:t>
-      </w:r>
-    </w:p>
-    <w:p/>
-    <w:p>
-      <w:r>
-        <w:t>الحلوى، الكراميل، النوجا، الحلويات.</w:t>
+        <w:t>من أجل صحتك، يجب تجنب تناول السكر.</w:t>
       </w:r>
     </w:p>
     <w:p>
       <w:r>
-        <w:t>-   الشوكولاتة، معجون الفواكه.</w:t>
+        <w:t>لا تأكل هذه المنتجات السكرية:</w:t>
       </w:r>
     </w:p>
     <w:p>
       <w:r>
-        <w:t>المعجنات، البسكويت، المعجنات الفرنسية (الكرواسون، خبز الشوكولاتة، البريوش ...).</w:t>
+        <w:t>• السكر، العسل، المربّى.</w:t>
       </w:r>
     </w:p>
     <w:p>
       <w:r>
-        <w:t>الفواكه المجففة، الفواكه المسكرة.</w:t>
+        <w:t>• النوتيلا وكريمة الكستناء.</w:t>
       </w:r>
     </w:p>
     <w:p>
       <w:r>
-        <w:t>الزبادي، الجبن الأبيض و"بيتي سويس" بالفواكه، الفلان، الحلويات.</w:t>
+        <w:t>• الحلوى، الشوكولاتة، والمعجنات.</w:t>
       </w:r>
     </w:p>
     <w:p>
       <w:r>
-        <w:t>الآيس كريم، السوربيه.</w:t>
+        <w:t>• البسكويت والمعجنات مثل الكرواسون والبريوش.</w:t>
       </w:r>
     </w:p>
     <w:p>
       <w:r>
-        <w:t>الحليب المكثف المحلى.</w:t>
+        <w:t>• الفواكه المجففة والفواكه المسكّرة.</w:t>
       </w:r>
     </w:p>
     <w:p>
       <w:r>
-        <w:t>عصائر الفاكهة، الشراب، المشروبات الغازية، الكوكا كولا، جميع المشروبات المحلاة المتوفرة في الأسواق.</w:t>
+        <w:t>لا تشرب هذه المشروبات:</w:t>
       </w:r>
     </w:p>
     <w:p>
       <w:r>
-        <w:t>جميع المشروبات الكحولية.</w:t>
+        <w:t>• عصائر الفواكه والشراب المركز.</w:t>
       </w:r>
     </w:p>
     <w:p>
       <w:r>
-        <w:t>فول الصويا والمنتجات المصنوعة من فول الصويا (التوفو)</w:t>
+        <w:t>• المشروبات الغازية مثل الكولا.</w:t>
       </w:r>
     </w:p>
     <w:p>
       <w:r>
-        <w:t>الأطعمة الحامضة أو الحارة.</w:t>
+        <w:t>• المشروبات التي تحتوي على الكحول.</w:t>
       </w:r>
     </w:p>
     <w:p>
       <w:r>
-        <w:t>AL</w:t>
+        <w:t>تجنب أيضًا:</w:t>
+      </w:r>
+    </w:p>
+    <w:p>
+      <w:r>
+        <w:t>• فول الصويا.</w:t>
+      </w:r>
+    </w:p>
+    <w:p>
+      <w:r>
+        <w:t>• الأطعمة الحارة أو الحامضة مثل الفلفل الحار والليمون.</w:t>
       </w:r>
     </w:p>
     <w:p>
@@ -138,162 +142,213 @@
     </w:p>
     <w:p>
       <w:r>
-        <w:t>الأطعمة الموصى بها</w:t>
+        <w:t>الأطعمة المسموحة</w:t>
       </w:r>
     </w:p>
     <w:p>
       <w:r>
-        <w:t>البروتينات الحيوانية: حصة واحدة على الأقل يوميًا</w:t>
-      </w:r>
-    </w:p>
-    <w:p/>
-    <w:p>
-      <w:r>
-        <w:t>اللحوم: لحم البقر، لحم العجل، لحم الضأن، لحم الخنزير، الدجاج، الأرنب، الدجاج البري، الديك الرومي، الديك الرومي الصغير.</w:t>
+        <w:t>اللحوم، السمك، والبيض</w:t>
       </w:r>
     </w:p>
     <w:p>
       <w:r>
-        <w:t>إذا لم تكوني محصنة ضد داء المقوسات، فتناولي اللحوم المطهية جيدًا، وتجنبي الريليت، والباتيه، وكبد الإوز، واللحوم في الهلام.</w:t>
+        <w:t>يجب تناول البروتين مرة واحدة على الأقل يوميًا.</w:t>
       </w:r>
     </w:p>
     <w:p>
       <w:r>
-        <w:t>الأسماك:  جميعها باستثناء سمك أبو سيف، والروبيان، والمحار النيء، والأسماك النيئة (السوشي، والتاراما، والسوريمي)، والأسماك المدخنة (الرنجة، والسلمون، والسلمون المرقط). يفضل تناول الأسماك الزرقاء: التونة، والسلمون، والماكريل، والسردين.</w:t>
+        <w:t>اللحوم:</w:t>
       </w:r>
     </w:p>
     <w:p>
       <w:r>
-        <w:t>البيض</w:t>
-      </w:r>
-    </w:p>
-    <w:p/>
-    <w:p>
-      <w:r>
-        <w:t>منتجات الألبان: 4 على الأقل يوميًا  بالإضافة إلى ما يتم تحضيره</w:t>
-      </w:r>
-    </w:p>
-    <w:p/>
-    <w:p>
-      <w:r>
-        <w:t>الجبن باستثناء: الجبن المصنوع من الحليب الخام، الجبن المبشور الصناعي، قشرة الجبن.</w:t>
+        <w:t>• يمكنك تناول لحم البقر، لحم العجل، لحم الخنزير، الدجاج، الأرنب، أو الديك الرومي.</w:t>
       </w:r>
     </w:p>
     <w:p>
       <w:r>
-        <w:t>الحليب: نصف منزوع الدسم.</w:t>
+        <w:t>• انتباه: إذا لم تكن لديك مناعة ضد داء المقوسات، يجب أن يكون اللحم مطبوخًا جيدًا جدًا.</w:t>
       </w:r>
     </w:p>
     <w:p>
       <w:r>
-        <w:t>منتجات الألبان: طبيعية، غير محلاة.</w:t>
-      </w:r>
-    </w:p>
-    <w:p/>
-    <w:p>
-      <w:r>
-        <w:t>الخضروات والفواكه:  في كل وجبة</w:t>
+        <w:t>• يجب تجنب: الرييت، الباتيه، كبد الأوز، واللحوم الهلامية.</w:t>
       </w:r>
     </w:p>
     <w:p>
       <w:r>
-        <w:t>.</w:t>
+        <w:t>السمك:</w:t>
       </w:r>
     </w:p>
     <w:p>
       <w:r>
-        <w:t>الخضروات الخضراء: طازجة، مجمدة بدون إضافات: حسب الرغبة.</w:t>
+        <w:t>• يمكنك تناول معظم أنواع السمك.</w:t>
       </w:r>
     </w:p>
     <w:p>
       <w:r>
-        <w:t>الفواكه:  جميعها مسموح بها، فاكهة واحدة كحلوى في كل وجبة،</w:t>
+        <w:t>• الأسماك الدهنية مفيدة للصحة مثل التونة، السلمون، السردين، والماكريل.</w:t>
       </w:r>
     </w:p>
     <w:p>
       <w:r>
-        <w:t>حصة من الفاكهة تعادل  4 قطع من السكر</w:t>
+        <w:t>• يجب تجنب: سمك أبو سيف، الروبيان، السمك النيء مثل السوشي، السوريمي، والسمك المدخن.</w:t>
       </w:r>
     </w:p>
     <w:p>
       <w:r>
-        <w:t>= ½ شمام،    شريحة كبيرة من البطيخ (250 غ)</w:t>
+        <w:t>البيض:</w:t>
       </w:r>
     </w:p>
     <w:p>
       <w:r>
-        <w:t>= 1 علبة صغيرة (250 غ) من الفراولة، التوت، الكشمش، العليق،  التوت البري، الكاسيس، …</w:t>
+        <w:t>• يمكنك تناول البيض بشرط أن يكون مطبوخًا جيدًا.</w:t>
+      </w:r>
+    </w:p>
+    <w:p/>
+    <w:p/>
+    <w:p>
+      <w:r>
+        <w:t>الحليب ومشتقاته</w:t>
       </w:r>
     </w:p>
     <w:p>
       <w:r>
-        <w:t>= 2 ماندرين، 4 كليمنتين «كورسي»، 2 كيوي، 1 جريب فروت صغير</w:t>
+        <w:t>يجب تناول أربعة منتجات ألبان يوميًا.</w:t>
       </w:r>
     </w:p>
     <w:p>
       <w:r>
-        <w:t>= 1 كمثرى، 1 تفاحة، 1 برتقالة، 1 خوخ أو بروغنون</w:t>
+        <w:t>• يمكنك تناول الحليب نصف منزوع الدسم.</w:t>
       </w:r>
     </w:p>
     <w:p>
       <w:r>
-        <w:t>= 3 إلى 4 مشمش، كويتش، رين كلود...، 8 ميرابيل، 10 ليتشي طازج</w:t>
+        <w:t>• يمكنك تناول الزبادي الطبيعي أو الجبن الأبيض.</w:t>
       </w:r>
     </w:p>
     <w:p>
       <w:r>
-        <w:t>= ¼ أناناس أو 4 شرائح، ½ مانجو أو 1 صغيرة</w:t>
+        <w:t>• يمكنك تناول الجبن.</w:t>
       </w:r>
     </w:p>
     <w:p>
       <w:r>
-        <w:t>= 12 إلى 15 حبة عنب أو كرز، 1 صغيرة أو ½ موزة</w:t>
+        <w:t>يجب تجنب:</w:t>
       </w:r>
     </w:p>
     <w:p>
       <w:r>
-        <w:t>= 2 إلى 3 حبات تمر، 3 إلى 4 حبات خوخ مجفف، 2 إلى 3 حبات تين طازج</w:t>
+        <w:t>• الجبن المصنوع من حليب خام.</w:t>
       </w:r>
     </w:p>
     <w:p>
       <w:r>
-        <w:t>= 1 كوب من الكومبوت</w:t>
+        <w:t>• الجبن المبشور الجاهز في الأكياس.</w:t>
       </w:r>
     </w:p>
     <w:p>
       <w:r>
-        <w:t>الأطعمة النشوية: في كل وجبة</w:t>
+        <w:t>• قشرة الجبن.</w:t>
+      </w:r>
+    </w:p>
+    <w:p/>
+    <w:p/>
+    <w:p>
+      <w:r>
+        <w:t>الخضروات والفواكه</w:t>
       </w:r>
     </w:p>
     <w:p>
       <w:r>
-        <w:t>الخبز: أو  البسكويت، خبز الماي...</w:t>
+        <w:t>يجب تناولها في كل وجبة.</w:t>
       </w:r>
     </w:p>
     <w:p>
       <w:r>
-        <w:t>الحبوب: المعكرونة، الأرز، السميد، البولينتا، البيلبيل، الكسكس...</w:t>
+        <w:t>الخضروات:</w:t>
       </w:r>
     </w:p>
     <w:p>
       <w:r>
-        <w:t>البطاطس: مهروسة، مطبوخة على البخار، مقلية، مقلية ...</w:t>
+        <w:t>• تناول الخضروات الخضراء حسب الرغبة، طازجة أو مجمّدة.</w:t>
       </w:r>
     </w:p>
     <w:p>
       <w:r>
-        <w:t>البقوليات: البازلاء، الفاصوليا، العدس، الحمص، الذرة، الفول، الفاصوليا  البيضاء أو الحمراء، البازلاء المكسرة والمنيهوت، الموز الأخضر، اليام ...</w:t>
-      </w:r>
-    </w:p>
-    <w:p/>
-    <w:p>
-      <w:r>
-        <w:t>يوم نموذجي</w:t>
+        <w:t>الفواكه:</w:t>
       </w:r>
     </w:p>
     <w:p>
       <w:r>
-        <w:t>الإفطار</w:t>
+        <w:t>• تناول فاكهة واحدة فقط في نهاية كل وجبة.</w:t>
+      </w:r>
+    </w:p>
+    <w:p>
+      <w:r>
+        <w:t>أمثلة على حصة واحدة من الفاكهة:</w:t>
+      </w:r>
+    </w:p>
+    <w:p>
+      <w:r>
+        <w:t>• تفاحة، كمثرى، برتقالة، أو خوخة.</w:t>
+      </w:r>
+    </w:p>
+    <w:p>
+      <w:r>
+        <w:t>• حبتان من الكيوي أو اليوسفي.</w:t>
+      </w:r>
+    </w:p>
+    <w:p>
+      <w:r>
+        <w:t>• علبة صغيرة من الفراولة أو التوت.</w:t>
+      </w:r>
+    </w:p>
+    <w:p>
+      <w:r>
+        <w:t>• 12 حبة عنب أو 12 حبة كرز.</w:t>
+      </w:r>
+    </w:p>
+    <w:p>
+      <w:r>
+        <w:t>• نصف موزة.</w:t>
+      </w:r>
+    </w:p>
+    <w:p>
+      <w:r>
+        <w:t>• كوب صغير من كومبوت بدون سكر.</w:t>
+      </w:r>
+    </w:p>
+    <w:p/>
+    <w:p/>
+    <w:p>
+      <w:r>
+        <w:t>النشويات</w:t>
+      </w:r>
+    </w:p>
+    <w:p>
+      <w:r>
+        <w:t>تعطي الجسم الطاقة، ويجب تناولها في كل وجبة.</w:t>
+      </w:r>
+    </w:p>
+    <w:p>
+      <w:r>
+        <w:t>• الخبز: خبز كامل، خبز أبيض، أو توست.</w:t>
+      </w:r>
+    </w:p>
+    <w:p>
+      <w:r>
+        <w:t>• الحبوب: معكرونة، أرز، سميد، بولينتا، كسكس.</w:t>
+      </w:r>
+    </w:p>
+    <w:p>
+      <w:r>
+        <w:t>• البطاطس: مطبوخة على البخار، مهروسة، أو في الفرن.</w:t>
+      </w:r>
+    </w:p>
+    <w:p>
+      <w:r>
+        <w:t>• البقوليات: عدس، حمص، فاصوليا، بازلاء، ذرة.</w:t>
       </w:r>
     </w:p>
     <w:p>
@@ -353,92 +408,97 @@
     </w:p>
     <w:p>
       <w:r>
-        <w:t>الإفطار:</w:t>
+        <w:t>مثال ليوم غذائي</w:t>
       </w:r>
     </w:p>
     <w:p>
       <w:r>
-        <w:t>مشروب: شاي، قهوة، كاكاو</w:t>
+        <w:t>في الصباح (الإفطار):</w:t>
       </w:r>
     </w:p>
     <w:p>
       <w:r>
-        <w:t>منتج ألبان: حليب، منتجات ألبان، جبن</w:t>
+        <w:t>• مشروب واحد: شاي، قهوة، أو كاكاو بدون سكر.</w:t>
       </w:r>
     </w:p>
     <w:p>
       <w:r>
-        <w:t>مصدر كربوهيدرات بطيئة: خبز كامل الحبوب أو خبز الحبوب غير المحلى + زبدة</w:t>
+        <w:t>• منتج ألبان واحد.</w:t>
       </w:r>
     </w:p>
     <w:p>
       <w:r>
-        <w:t>الغداء والعشاء:</w:t>
+        <w:t>• خبز كامل أو حبوب بدون سكر مع كمية قليلة من الزبدة.</w:t>
       </w:r>
     </w:p>
     <w:p>
       <w:r>
-        <w:t>خضروات خضراء حسب الرغبة</w:t>
+        <w:t>في الغداء والعشاء:</w:t>
       </w:r>
     </w:p>
     <w:p>
       <w:r>
-        <w:t>حصة من اللحم أو السمك أو البيض (أو لحم خنزير)</w:t>
+        <w:t>• خضروات خضراء.</w:t>
       </w:r>
     </w:p>
     <w:p>
       <w:r>
-        <w:t>حصة من السكريات البطيئة:</w:t>
+        <w:t>• حصة من اللحم أو السمك أو البيض.</w:t>
       </w:r>
     </w:p>
     <w:p>
       <w:r>
-        <w:t>طبق صغير من النشويات + قطعة صغيرة من الخبز</w:t>
+        <w:t>• حصة من النشويات حسب الاختيار:</w:t>
       </w:r>
     </w:p>
     <w:p>
       <w:r>
-        <w:t>أو   طبق أكبر من النشويات ولكن بدون خبز</w:t>
+        <w:t>• طبق نشويات مع قطعة خبز صغيرة.</w:t>
       </w:r>
     </w:p>
     <w:p>
       <w:r>
-        <w:t>أو   قطعة كبيرة من الخبز بدون نشويات</w:t>
+        <w:t>• أو طبق كبير من النشويات بدون خبز.</w:t>
       </w:r>
     </w:p>
     <w:p>
       <w:r>
-        <w:t>منتج ألبان</w:t>
+        <w:t>• أو قطعة خبز كبيرة بدون نشويات.</w:t>
       </w:r>
     </w:p>
     <w:p>
       <w:r>
-        <w:t>فاكهة</w:t>
+        <w:t>• منتج ألبان واحد.</w:t>
       </w:r>
     </w:p>
     <w:p>
       <w:r>
-        <w:t>وجبة خفيفة اختيارية:</w:t>
+        <w:t>• فاكهة واحدة.</w:t>
       </w:r>
     </w:p>
     <w:p>
       <w:r>
-        <w:t>إذا كنت تشعر بالجوع حقًا،  تناول فقط الأطعمة التي لا تحتوي على سكريات</w:t>
+        <w:t>إذا شعرت بالجوع بين الوجبات:</w:t>
       </w:r>
     </w:p>
     <w:p>
       <w:r>
-        <w:t>منتجات ألبان</w:t>
+        <w:t>يجب تجنب السكر. يمكن تناول:</w:t>
       </w:r>
     </w:p>
     <w:p>
       <w:r>
-        <w:t>خضروات نيئة</w:t>
+        <w:t>• زبادي طبيعي.</w:t>
       </w:r>
     </w:p>
     <w:p>
       <w:r>
-        <w:t>بيضة مسلوقة، لحم خنزير……</w:t>
+        <w:t>• خضروات نيئة مثل الجزر أو الخيار.</w:t>
+      </w:r>
+    </w:p>
+    <w:p>
+      <w:r>
+        <w:t>• بيضة مسلوقة أو شريحة لحم بارد.</w:t>
       </w:r>
     </w:p>
     <w:p>

</xml_diff>